<commit_message>
Build executive overview and asset reliability dashboards
Validated KPI measures, corrected work-order counting logic, completed the working Executive Overview and Asset Reliability pages, and created the Maintenance and Failure Analysis page shell.
</commit_message>
<xml_diff>
--- a/06_docs/DAX_Measure_Dictionary.docx
+++ b/06_docs/DAX_Measure_Dictionary.docx
@@ -1,6 +1,6 @@
 
 <file path=word/document.xml><?xml version="1.0" encoding="utf-8"?>
-<w:document xmlns:wpc="http://schemas.microsoft.com/office/word/2010/wordprocessingCanvas" xmlns:cx="http://schemas.microsoft.com/office/drawing/2014/chartex" xmlns:cx1="http://schemas.microsoft.com/office/drawing/2015/9/8/chartex" xmlns:cx2="http://schemas.microsoft.com/office/drawing/2015/10/21/chartex" xmlns:cx3="http://schemas.microsoft.com/office/drawing/2016/5/9/chartex" xmlns:cx4="http://schemas.microsoft.com/office/drawing/2016/5/10/chartex" xmlns:cx5="http://schemas.microsoft.com/office/drawing/2016/5/11/chartex" xmlns:cx6="http://schemas.microsoft.com/office/drawing/2016/5/12/chartex" xmlns:cx7="http://schemas.microsoft.com/office/drawing/2016/5/13/chartex" xmlns:cx8="http://schemas.microsoft.com/office/drawing/2016/5/14/chartex" xmlns:mc="http://schemas.openxmlformats.org/markup-compatibility/2006" xmlns:aink="http://schemas.microsoft.com/office/drawing/2016/ink" xmlns:am3d="http://schemas.microsoft.com/office/drawing/2017/model3d" xmlns:o="urn:schemas-microsoft-com:office:office" xmlns:oel="http://schemas.microsoft.com/office/2019/extlst" xmlns:r="http://schemas.openxmlformats.org/officeDocument/2006/relationships" xmlns:m="http://schemas.openxmlformats.org/officeDocument/2006/math" xmlns:v="urn:schemas-microsoft-com:vml" xmlns:wp14="http://schemas.microsoft.com/office/word/2010/wordprocessingDrawing" xmlns:wp="http://schemas.openxmlformats.org/drawingml/2006/wordprocessingDrawing" xmlns:w10="urn:schemas-microsoft-com:office:word" xmlns:w="http://schemas.openxmlformats.org/wordprocessingml/2006/main" xmlns:w14="http://schemas.microsoft.com/office/word/2010/wordml" xmlns:w15="http://schemas.microsoft.com/office/word/2012/wordml" xmlns:w16cex="http://schemas.microsoft.com/office/word/2018/wordml/cex" xmlns:w16cid="http://schemas.microsoft.com/office/word/2016/wordml/cid" xmlns:w16="http://schemas.microsoft.com/office/word/2018/wordml" xmlns:w16du="http://schemas.microsoft.com/office/word/2023/wordml/word16du" xmlns:w16sdtdh="http://schemas.microsoft.com/office/word/2020/wordml/sdtdatahash" xmlns:w16sdtfl="http://schemas.microsoft.com/office/word/2024/wordml/sdtformatlock" xmlns:w16se="http://schemas.microsoft.com/office/word/2015/wordml/symex" xmlns:wpg="http://schemas.microsoft.com/office/word/2010/wordprocessingGroup" xmlns:wpi="http://schemas.microsoft.com/office/word/2010/wordprocessingInk" xmlns:wne="http://schemas.microsoft.com/office/word/2006/wordml" xmlns:wps="http://schemas.microsoft.com/office/word/2010/wordprocessingShape" mc:Ignorable="w14 w15 w16se w16cid w16 w16cex w16sdtdh w16sdtfl w16du wp14">
+<w:document xmlns:wpc="http://schemas.microsoft.com/office/word/2010/wordprocessingCanvas" xmlns:cx="http://schemas.microsoft.com/office/drawing/2014/chartex" xmlns:cx1="http://schemas.microsoft.com/office/drawing/2015/9/8/chartex" xmlns:cx2="http://schemas.microsoft.com/office/drawing/2015/10/21/chartex" xmlns:cx3="http://schemas.microsoft.com/office/drawing/2016/5/9/chartex" xmlns:cx4="http://schemas.microsoft.com/office/drawing/2016/5/10/chartex" xmlns:cx5="http://schemas.microsoft.com/office/drawing/2016/5/11/chartex" xmlns:cx6="http://schemas.microsoft.com/office/drawing/2016/5/12/chartex" xmlns:cx7="http://schemas.microsoft.com/office/drawing/2016/5/13/chartex" xmlns:cx8="http://schemas.microsoft.com/office/drawing/2016/5/14/chartex" xmlns:mc="http://schemas.openxmlformats.org/markup-compatibility/2006" xmlns:aink="http://schemas.microsoft.com/office/drawing/2016/ink" xmlns:am3d="http://schemas.microsoft.com/office/drawing/2017/model3d" xmlns:o="urn:schemas-microsoft-com:office:office" xmlns:oel="http://schemas.microsoft.com/office/2019/extlst" xmlns:r="http://schemas.openxmlformats.org/officeDocument/2006/relationships" xmlns:m="http://schemas.openxmlformats.org/officeDocument/2006/math" xmlns:v="urn:schemas-microsoft-com:vml" xmlns:wp14="http://schemas.microsoft.com/office/word/2010/wordprocessingDrawing" xmlns:wp="http://schemas.openxmlformats.org/drawingml/2006/wordprocessingDrawing" xmlns:w10="urn:schemas-microsoft-com:office:word" xmlns:w="http://schemas.openxmlformats.org/wordprocessingml/2006/main" xmlns:w14="http://schemas.microsoft.com/office/word/2010/wordml" xmlns:w15="http://schemas.microsoft.com/office/word/2012/wordml" xmlns:w16cei="http://schemas.microsoft.com/office/word/2026/wordml/cei" xmlns:w16cex="http://schemas.microsoft.com/office/word/2018/wordml/cex" xmlns:w16cid="http://schemas.microsoft.com/office/word/2016/wordml/cid" xmlns:w16="http://schemas.microsoft.com/office/word/2018/wordml" xmlns:w16du="http://schemas.microsoft.com/office/word/2023/wordml/word16du" xmlns:w16sdtdh="http://schemas.microsoft.com/office/word/2020/wordml/sdtdatahash" xmlns:w16sdtfl="http://schemas.microsoft.com/office/word/2024/wordml/sdtformatlock" xmlns:w16se="http://schemas.microsoft.com/office/word/2015/wordml/symex" xmlns:wpg="http://schemas.microsoft.com/office/word/2010/wordprocessingGroup" xmlns:wpi="http://schemas.microsoft.com/office/word/2010/wordprocessingInk" xmlns:wne="http://schemas.microsoft.com/office/word/2006/wordml" xmlns:wps="http://schemas.microsoft.com/office/word/2010/wordprocessingShape" mc:Ignorable="w14 w15 w16se w16cid w16 w16cex w16sdtdh w16sdtfl w16du wp14">
   <w:body>
     <w:p>
       <w:pPr>
@@ -22,24 +22,323 @@
       </w:r>
     </w:p>
     <w:p>
+      <w:pPr>
+        <w:jc w:val="right"/>
+      </w:pPr>
       <w:r>
         <w:t>Date:</w:t>
       </w:r>
     </w:p>
     <w:p>
+      <w:pPr>
+        <w:jc w:val="right"/>
+      </w:pPr>
       <w:r>
         <w:t>24/07/2026</w:t>
       </w:r>
     </w:p>
+    <w:p>
+      <w:r>
+        <w:rPr>
+          <w:b/>
+          <w:bCs/>
+        </w:rPr>
+        <w:t>Purpose</w:t>
+      </w:r>
+      <w:r>
+        <w:t>:</w:t>
+      </w:r>
+    </w:p>
+    <w:p>
+      <w:r>
+        <w:t>Created DAX measures to support the Power BI dashboard for fleet reliability, maintenance performance, fuel usage, operations and data quality.</w:t>
+      </w:r>
+    </w:p>
     <w:p/>
     <w:p>
-      <w:r>
+      <w:pPr>
+        <w:rPr>
+          <w:b/>
+          <w:bCs/>
+        </w:rPr>
+      </w:pPr>
+      <w:r>
+        <w:rPr>
+          <w:b/>
+          <w:bCs/>
+        </w:rPr>
+        <w:t>Measure groups created:</w:t>
+      </w:r>
+    </w:p>
+    <w:p>
+      <w:r>
+        <w:t>- Operations and reliability measures</w:t>
+      </w:r>
+    </w:p>
+    <w:p>
+      <w:r>
+        <w:t>- Maintenance performance measures</w:t>
+      </w:r>
+    </w:p>
+    <w:p>
+      <w:r>
+        <w:t>- Breakdown and asset measures</w:t>
+      </w:r>
+    </w:p>
+    <w:p>
+      <w:r>
+        <w:t>- Data quality and exclusion measures</w:t>
+      </w:r>
+    </w:p>
+    <w:p>
+      <w:r>
+        <w:t>- Fuel and operations measures</w:t>
+      </w:r>
+    </w:p>
+    <w:p>
+      <w:r>
+        <w:t>- Executive KPI helper measures</w:t>
+      </w:r>
+    </w:p>
+    <w:p/>
+    <w:p>
+      <w:pPr>
+        <w:rPr>
+          <w:b/>
+          <w:bCs/>
+        </w:rPr>
+      </w:pPr>
+      <w:r>
+        <w:rPr>
+          <w:b/>
+          <w:bCs/>
+        </w:rPr>
+        <w:t>Key measures include:</w:t>
+      </w:r>
+    </w:p>
+    <w:p>
+      <w:r>
+        <w:t>Total Operating Hours</w:t>
+      </w:r>
+    </w:p>
+    <w:p>
+      <w:r>
+        <w:t>Total Downtime Hours</w:t>
+      </w:r>
+    </w:p>
+    <w:p>
+      <w:r>
+        <w:t>Downtime Rate %</w:t>
+      </w:r>
+    </w:p>
+    <w:p>
+      <w:r>
+        <w:t>Valid Work Order Count</w:t>
+      </w:r>
+    </w:p>
+    <w:p>
+      <w:r>
+        <w:t>Total Work Order Downtime Hours</w:t>
+      </w:r>
+    </w:p>
+    <w:p>
+      <w:r>
+        <w:t>Total Maintenance Cost</w:t>
+      </w:r>
+    </w:p>
+    <w:p>
+      <w:r>
+        <w:t>Breakdown Count</w:t>
+      </w:r>
+    </w:p>
+    <w:p>
+      <w:r>
+        <w:t>Asset Count</w:t>
+      </w:r>
+    </w:p>
+    <w:p>
+      <w:r>
+        <w:t>Excluded Work Order Count</w:t>
+      </w:r>
+    </w:p>
+    <w:p>
+      <w:r>
+        <w:t>Excluded Shift Record Count</w:t>
+      </w:r>
+    </w:p>
+    <w:p>
+      <w:r>
+        <w:t>Excluded Fuel Record Count</w:t>
+      </w:r>
+    </w:p>
+    <w:p>
+      <w:r>
+        <w:t>Total Excluded Record Count</w:t>
+      </w:r>
+    </w:p>
+    <w:p>
+      <w:r>
+        <w:lastRenderedPageBreak/>
+        <w:t>Total Fuel Litres</w:t>
+      </w:r>
+    </w:p>
+    <w:p>
+      <w:r>
+        <w:t>Fuel Litres per Operating Hour</w:t>
+      </w:r>
+    </w:p>
+    <w:p>
+      <w:r>
+        <w:t>Average Maintenance Cost per Asset</w:t>
+      </w:r>
+    </w:p>
+    <w:p>
+      <w:r>
+        <w:t>Average Downtime per Asset</w:t>
+      </w:r>
+    </w:p>
+    <w:p>
+      <w:r>
+        <w:t>Average Fuel Litres per Asset</w:t>
+      </w:r>
+    </w:p>
+    <w:p/>
+    <w:p>
+      <w:pPr>
+        <w:rPr>
+          <w:b/>
+          <w:bCs/>
+        </w:rPr>
+      </w:pPr>
+      <w:r>
+        <w:rPr>
+          <w:b/>
+          <w:bCs/>
+        </w:rPr>
+        <w:t>Why it matters:</w:t>
+      </w:r>
+    </w:p>
+    <w:p>
+      <w:r>
+        <w:t>The dashboard will be built from reusable DAX measures rather than dragging raw columns into visuals. This makes the report more reliable, easier to audit and easier to extend.</w:t>
+      </w:r>
+    </w:p>
+    <w:p/>
+    <w:p>
+      <w:pPr>
+        <w:jc w:val="right"/>
+      </w:pPr>
+      <w:r>
+        <w:rPr>
+          <w:b/>
+          <w:bCs/>
+        </w:rPr>
+        <w:t>Date</w:t>
+      </w:r>
+      <w:r>
+        <w:t>:</w:t>
+      </w:r>
+    </w:p>
+    <w:p>
+      <w:pPr>
+        <w:jc w:val="right"/>
+      </w:pPr>
+      <w:r>
+        <w:t>28/07/2026</w:t>
+      </w:r>
+    </w:p>
+    <w:p>
+      <w:pPr>
+        <w:rPr>
+          <w:b/>
+          <w:bCs/>
+        </w:rPr>
+      </w:pPr>
+      <w:r>
+        <w:rPr>
+          <w:b/>
+          <w:bCs/>
+        </w:rPr>
+        <w:t>Measure added during dashboard validation</w:t>
+      </w:r>
+    </w:p>
+    <w:p>
+      <w:pPr>
+        <w:rPr>
+          <w:b/>
+          <w:bCs/>
+        </w:rPr>
+      </w:pPr>
+      <w:r>
+        <w:rPr>
+          <w:b/>
+          <w:bCs/>
+        </w:rPr>
+        <w:t>Work Order Record Count</w:t>
+      </w:r>
+    </w:p>
+    <w:p>
+      <w:pPr>
+        <w:rPr>
+          <w:b/>
+          <w:bCs/>
+        </w:rPr>
+      </w:pPr>
+      <w:r>
+        <w:rPr>
+          <w:b/>
+          <w:bCs/>
+        </w:rPr>
+        <w:t>DAX:</w:t>
+      </w:r>
+    </w:p>
+    <w:p>
+      <w:r>
+        <w:t>Work Order Record Count =</w:t>
+      </w:r>
+      <w:r>
+        <w:t xml:space="preserve"> </w:t>
+      </w:r>
+      <w:proofErr w:type="gramStart"/>
+      <w:r>
+        <w:t>COUNTROWS(</w:t>
+      </w:r>
+      <w:proofErr w:type="spellStart"/>
+      <w:proofErr w:type="gramEnd"/>
+      <w:r>
+        <w:t>stg_maintenance_work_orders</w:t>
+      </w:r>
+      <w:proofErr w:type="spellEnd"/>
+      <w:r>
+        <w:t>)</w:t>
+      </w:r>
+    </w:p>
+    <w:p>
+      <w:pPr>
+        <w:rPr>
+          <w:b/>
+          <w:bCs/>
+        </w:rPr>
+      </w:pPr>
+    </w:p>
+    <w:p>
+      <w:pPr>
+        <w:rPr>
+          <w:b/>
+          <w:bCs/>
+        </w:rPr>
+      </w:pPr>
+      <w:r>
+        <w:rPr>
+          <w:b/>
+          <w:bCs/>
+        </w:rPr>
         <w:t>Purpose:</w:t>
       </w:r>
     </w:p>
     <w:p>
       <w:r>
-        <w:t>Created DAX measures to support the Power BI dashboard for fleet reliability, maintenance performance, fuel usage, operations and data quality.</w:t>
+        <w:t>Counts every row in the maintenance work-order table, including records that are not eligible for schedule-compliance or general valid-work-order KPIs.</w:t>
       </w:r>
     </w:p>
     <w:p/>
@@ -55,37 +354,12 @@
           <w:b/>
           <w:bCs/>
         </w:rPr>
-        <w:t>Measure groups created:</w:t>
-      </w:r>
-    </w:p>
-    <w:p>
-      <w:r>
-        <w:t>- Operations and reliability measures</w:t>
-      </w:r>
-    </w:p>
-    <w:p>
-      <w:r>
-        <w:t>- Maintenance performance measures</w:t>
-      </w:r>
-    </w:p>
-    <w:p>
-      <w:r>
-        <w:t>- Breakdown and asset measures</w:t>
-      </w:r>
-    </w:p>
-    <w:p>
-      <w:r>
-        <w:t>- Data quality and exclusion measures</w:t>
-      </w:r>
-    </w:p>
-    <w:p>
-      <w:r>
-        <w:t>- Fuel and operations measures</w:t>
-      </w:r>
-    </w:p>
-    <w:p>
-      <w:r>
-        <w:t>- Executive KPI helper measures</w:t>
+        <w:t>Use:</w:t>
+      </w:r>
+    </w:p>
+    <w:p>
+      <w:r>
+        <w:t>Used for work-order frequency analysis by failure category. Preventive Maintenance is excluded at the visual level when the analytical question is specifically about corrective failures.</w:t>
       </w:r>
     </w:p>
     <w:p/>
@@ -101,93 +375,32 @@
           <w:b/>
           <w:bCs/>
         </w:rPr>
-        <w:t>Key measures include:</w:t>
-      </w:r>
-    </w:p>
-    <w:p>
-      <w:r>
-        <w:t>Total Operating Hours</w:t>
-      </w:r>
-    </w:p>
-    <w:p>
-      <w:r>
-        <w:t>Total Downtime Hours</w:t>
-      </w:r>
-    </w:p>
-    <w:p>
-      <w:r>
-        <w:t>Downtime Rate %</w:t>
-      </w:r>
-    </w:p>
-    <w:p>
-      <w:r>
-        <w:t>Valid Work Order Count</w:t>
-      </w:r>
-    </w:p>
-    <w:p>
-      <w:r>
-        <w:t>Total Work Order Downtime Hours</w:t>
-      </w:r>
-    </w:p>
-    <w:p>
-      <w:r>
-        <w:t>Total Maintenance Cost</w:t>
-      </w:r>
-    </w:p>
-    <w:p>
-      <w:r>
-        <w:t>Breakdown Count</w:t>
-      </w:r>
-    </w:p>
-    <w:p>
-      <w:r>
-        <w:t>Asset Count</w:t>
-      </w:r>
-    </w:p>
-    <w:p>
-      <w:r>
-        <w:t>Excluded Work Order Count</w:t>
-      </w:r>
-    </w:p>
-    <w:p>
-      <w:r>
-        <w:t>Excluded Shift Record Count</w:t>
-      </w:r>
-    </w:p>
-    <w:p>
-      <w:r>
-        <w:t>Excluded Fuel Record Count</w:t>
-      </w:r>
-    </w:p>
-    <w:p>
+        <w:t xml:space="preserve">Governance </w:t>
+      </w:r>
+      <w:proofErr w:type="gramStart"/>
+      <w:r>
+        <w:rPr>
+          <w:b/>
+          <w:bCs/>
+        </w:rPr>
+        <w:t>note</w:t>
+      </w:r>
+      <w:proofErr w:type="gramEnd"/>
+      <w:r>
+        <w:rPr>
+          <w:b/>
+          <w:bCs/>
+        </w:rPr>
+        <w:t>:</w:t>
+      </w:r>
+    </w:p>
+    <w:p>
+      <w:r>
+        <w:t xml:space="preserve">This measure does not replace Valid Work Order Count. Valid Work Order Count remains appropriate for KPIs that require records meeting the existing work-order </w:t>
+      </w:r>
       <w:r>
         <w:lastRenderedPageBreak/>
-        <w:t>Total Excluded Record Count</w:t>
-      </w:r>
-    </w:p>
-    <w:p>
-      <w:r>
-        <w:t>Total Fuel Litres</w:t>
-      </w:r>
-    </w:p>
-    <w:p>
-      <w:r>
-        <w:t>Fuel Litres per Operating Hour</w:t>
-      </w:r>
-    </w:p>
-    <w:p>
-      <w:r>
-        <w:t>Average Maintenance Cost per Asset</w:t>
-      </w:r>
-    </w:p>
-    <w:p>
-      <w:r>
-        <w:t>Average Downtime per Asset</w:t>
-      </w:r>
-    </w:p>
-    <w:p>
-      <w:r>
-        <w:t>Average Fuel Litres per Asset</w:t>
+        <w:t>inclusion rules. Work Order Record Count is a purpose-specific measure for analyses where missing planned start dates do not invalidate the record.</w:t>
       </w:r>
     </w:p>
     <w:p/>
@@ -203,12 +416,12 @@
           <w:b/>
           <w:bCs/>
         </w:rPr>
-        <w:t>Why it matters:</w:t>
-      </w:r>
-    </w:p>
-    <w:p>
-      <w:r>
-        <w:t>The dashboard will be built from reusable DAX measures rather than dragging raw columns into visuals. This makes the report more reliable, easier to audit and easier to extend.</w:t>
+        <w:t>Reason created:</w:t>
+      </w:r>
+    </w:p>
+    <w:p>
+      <w:r>
+        <w:t>Dashboard validation showed that Valid Work Order Count excluded most corrective maintenance records because many did not contain planned start dates. Using the purpose-specific measure prevented the failure-category chart from producing a misleading result.</w:t>
       </w:r>
     </w:p>
     <w:sectPr>
@@ -824,6 +1037,7 @@
   <w:style w:type="character" w:default="1" w:styleId="DefaultParagraphFont">
     <w:name w:val="Default Paragraph Font"/>
     <w:uiPriority w:val="1"/>
+    <w:semiHidden/>
     <w:unhideWhenUsed/>
   </w:style>
   <w:style w:type="table" w:default="1" w:styleId="TableNormal">
@@ -1136,6 +1350,24 @@
       <w:color w:val="0F4761" w:themeColor="accent1" w:themeShade="BF"/>
       <w:spacing w:val="5"/>
     </w:rPr>
+  </w:style>
+  <w:style w:type="paragraph" w:styleId="Date">
+    <w:name w:val="Date"/>
+    <w:basedOn w:val="Normal"/>
+    <w:next w:val="Normal"/>
+    <w:link w:val="DateChar"/>
+    <w:uiPriority w:val="99"/>
+    <w:semiHidden/>
+    <w:unhideWhenUsed/>
+    <w:rsid w:val="000E52A9"/>
+  </w:style>
+  <w:style w:type="character" w:customStyle="1" w:styleId="DateChar">
+    <w:name w:val="Date Char"/>
+    <w:basedOn w:val="DefaultParagraphFont"/>
+    <w:link w:val="Date"/>
+    <w:uiPriority w:val="99"/>
+    <w:semiHidden/>
+    <w:rsid w:val="000E52A9"/>
   </w:style>
 </w:styles>
 </file>

</xml_diff>